<commit_message>
Clarify MODX role: maintain/develop, not build
The 13 MODX sites are maintained & developed (not built); only the 12
WordPress + 6 custom sites were designed and built. Updated across the
site and both CV files:
- Hero stat 31 -> 18 "designed & built"
- Selected Work + About reworded to separate built vs maintained
- Experience: added MODX maintenance bullet
- Regenerated CV PDF + Word

Co-Authored-By: Claude Opus 4.8 <noreply@anthropic.com>
</commit_message>
<xml_diff>
--- a/public/Charalampos-Photiou-CV.docx
+++ b/public/Charalampos-Photiou-CV.docx
@@ -47,7 +47,7 @@
         </w:rPr>
         <w:t xml:space="preserve">Limassol, Cyprus  •  +357 96 425378  •  </w:t>
       </w:r>
-      <w:hyperlink w:history="1" r:id="rIdsf_8vmglvl-wismh-tkdh">
+      <w:hyperlink w:history="1" r:id="rIdhndls7a2ed21nlutgmzrg">
         <w:r>
           <w:rPr>
             <w:color w:val="5B6573"/>
@@ -65,7 +65,7 @@
         </w:rPr>
         <w:t xml:space="preserve">  •  </w:t>
       </w:r>
-      <w:hyperlink w:history="1" r:id="rIdqkg45b2o0fwhcye-b5yc8">
+      <w:hyperlink w:history="1" r:id="rIdd8ap3ux10nazt0anliayl">
         <w:r>
           <w:rPr>
             <w:color w:val="5B6573"/>
@@ -83,7 +83,7 @@
         </w:rPr>
         <w:t xml:space="preserve">  •  </w:t>
       </w:r>
-      <w:hyperlink w:history="1" r:id="rIdfftfnerip6nqvb65gexho">
+      <w:hyperlink w:history="1" r:id="rIdfdendvzcop-dfpnncpg7x">
         <w:r>
           <w:rPr>
             <w:color w:val="5B6573"/>
@@ -122,7 +122,7 @@
           <w:sz w:val="19"/>
           <w:szCs w:val="19"/>
         </w:rPr>
-        <w:t xml:space="preserve">Web developer and digital marketing executive with 3+ years at Fameline Holding Group, pairing hands-on web development with full-funnel marketing. Manages a portfolio of 50+ live websites and has designed and built 30+ sites across three stacks — WordPress (Elementor Pro, WPBakery, Divi), MODX Revolution, and custom sites hand-coded in VS Code with Git/GitHub and AI-assisted workflows. Runs paid media on Google Ads (Search to Performance Max), email marketing in Mailchimp and Brevo, SEO, and social — backed by Google and AI certifications.</w:t>
+        <w:t xml:space="preserve">Web developer and digital marketing executive with 3+ years at Fameline Holding Group, pairing hands-on web development with full-funnel marketing. Manages a portfolio of 50+ live websites: builds on WordPress (Elementor Pro, WPBakery, Divi) and hand-codes custom sites in VS Code with Git/GitHub and AI-assisted workflows, and maintains and develops MODX Revolution sites. Runs paid media on Google Ads (Search to Performance Max), email marketing in Mailchimp and Brevo, SEO, and social — backed by Google and AI certifications.</w:t>
       </w:r>
     </w:p>
     <w:p>
@@ -217,6 +217,24 @@
           <w:sz w:val="19"/>
           <w:szCs w:val="19"/>
         </w:rPr>
+        <w:t xml:space="preserve">Maintain and develop MODX Revolution sites across the group’s brands — edits, updates, and new content.</w:t>
+      </w:r>
+    </w:p>
+    <w:p>
+      <w:pPr>
+        <w:pStyle w:val="ListParagraph"/>
+        <w:numPr>
+          <w:ilvl w:val="0"/>
+          <w:numId w:val="1"/>
+        </w:numPr>
+        <w:spacing w:after="30"/>
+      </w:pPr>
+      <w:r>
+        <w:rPr>
+          <w:color w:val="2B313B"/>
+          <w:sz w:val="19"/>
+          <w:szCs w:val="19"/>
+        </w:rPr>
         <w:t xml:space="preserve">Manage a portfolio of 50+ live websites — updates, performance, uptime, and security across the group’s brands.</w:t>
       </w:r>
     </w:p>
@@ -545,15 +563,15 @@
           <w:sz w:val="19"/>
           <w:szCs w:val="19"/>
         </w:rPr>
-        <w:t xml:space="preserve">30+ live corporate websites</w:t>
-      </w:r>
-      <w:r>
-        <w:rPr>
-          <w:color w:val="2B313B"/>
-          <w:sz w:val="19"/>
-          <w:szCs w:val="19"/>
-        </w:rPr>
-        <w:t xml:space="preserve"> designed and built for the Fameline Holding Group brands and beyond, including Fameline Holding Group, Fameline Mission Solutions, OneNet Group, MIE Group, Euploia Partners, NorthTide and Kozy Developers (WordPress); Fameline Energy, Sheerline, HSS Marine Safety and Euploia Drydocks (MODX); and the hand-coded Albaflux, Seaflux and Cargo Logistics brands (custom). Full list with live links on the portfolio.</w:t>
+        <w:t xml:space="preserve">18 live corporate websites designed and built</w:t>
+      </w:r>
+      <w:r>
+        <w:rPr>
+          <w:color w:val="2B313B"/>
+          <w:sz w:val="19"/>
+          <w:szCs w:val="19"/>
+        </w:rPr>
+        <w:t xml:space="preserve"> — on WordPress + Elementor (Fameline Holding Group, Fameline Mission Solutions, OneNet Group, MIE Group, Euploia Partners, NorthTide, Kozy Developers) and hand-coded in VS Code (Albaflux, Seaflux and the Cargo Logistics brands). I also maintain and develop 13 MODX Revolution sites (Fameline Energy, Sheerline, HSS Marine Safety, Euploia Drydocks, and more). Full list with live links on the portfolio.</w:t>
       </w:r>
     </w:p>
     <w:p>

</xml_diff>

<commit_message>
Normalise CV font sizes + add AI tools
- Unify body text to 0.9rem and meta to 0.82rem across summary, bullets,
  skills, certs and selected work (was a mix of 0.86/0.92/0.8/0.85)
- Add Figma AI and expand Claude to (Code, Cowork & design) on the site
  Skills and both CV files

Co-Authored-By: Claude Opus 4.8 <noreply@anthropic.com>
</commit_message>
<xml_diff>
--- a/public/Charalampos-Photiou-CV.docx
+++ b/public/Charalampos-Photiou-CV.docx
@@ -47,7 +47,7 @@
         </w:rPr>
         <w:t xml:space="preserve">Limassol, Cyprus  •  +357 96 425378  •  </w:t>
       </w:r>
-      <w:hyperlink w:history="1" r:id="rIdhndls7a2ed21nlutgmzrg">
+      <w:hyperlink w:history="1" r:id="rIdqfghjvc25rzawslv1ftj-">
         <w:r>
           <w:rPr>
             <w:color w:val="5B6573"/>
@@ -65,7 +65,7 @@
         </w:rPr>
         <w:t xml:space="preserve">  •  </w:t>
       </w:r>
-      <w:hyperlink w:history="1" r:id="rIdd8ap3ux10nazt0anliayl">
+      <w:hyperlink w:history="1" r:id="rIdgqhsgipvz7xi8oaebps4w">
         <w:r>
           <w:rPr>
             <w:color w:val="5B6573"/>
@@ -83,7 +83,7 @@
         </w:rPr>
         <w:t xml:space="preserve">  •  </w:t>
       </w:r>
-      <w:hyperlink w:history="1" r:id="rIdfdendvzcop-dfpnncpg7x">
+      <w:hyperlink w:history="1" r:id="rId4mdf_6jns7kz7h_odzlp7">
         <w:r>
           <w:rPr>
             <w:color w:val="5B6573"/>
@@ -830,7 +830,7 @@
           <w:sz w:val="19"/>
           <w:szCs w:val="19"/>
         </w:rPr>
-        <w:t xml:space="preserve">AI strategy &amp; integration, data-driven decisions, business intelligence; ChatGPT, Google Gemini, Claude (Code &amp; Cowork).</w:t>
+        <w:t xml:space="preserve">AI strategy &amp; integration, data-driven decisions, business intelligence; ChatGPT, Google Gemini, Claude (Code, Cowork &amp; design), Figma AI.</w:t>
       </w:r>
     </w:p>
     <w:p>

</xml_diff>